<commit_message>
Todo negro + tipografia estandar + flujo Pro demo + vercel.app scaffold
</commit_message>
<xml_diff>
--- a/output/Laura_Gomez_CV_EN.docx
+++ b/output/Laura_Gomez_CV_EN.docx
@@ -7,7 +7,7 @@
         <w:rPr>
           <w:rFonts w:ascii="Arial" w:hAnsi="Arial"/>
           <w:b/>
-          <w:color w:val="1E3D59"/>
+          <w:color w:val="000000"/>
           <w:sz w:val="40"/>
         </w:rPr>
         <w:t>Laura Gomez</w:t>
@@ -18,7 +18,7 @@
         <w:rPr>
           <w:rFonts w:ascii="Arial" w:hAnsi="Arial"/>
           <w:b/>
-          <w:color w:val="17B978"/>
+          <w:color w:val="000000"/>
           <w:sz w:val="21"/>
         </w:rPr>
         <w:t>Data Engineer</w:t>
@@ -32,7 +32,7 @@
         <w:rPr>
           <w:rFonts w:ascii="Arial" w:hAnsi="Arial"/>
           <w:i/>
-          <w:color w:val="555555"/>
+          <w:color w:val="444444"/>
           <w:sz w:val="17"/>
         </w:rPr>
         <w:t>I turn complex data into reliable products and decisions</w:t>
@@ -47,7 +47,7 @@
       <w:r>
         <w:rPr>
           <w:rFonts w:ascii="Arial" w:hAnsi="Arial"/>
-          <w:color w:val="555555"/>
+          <w:color w:val="444444"/>
           <w:sz w:val="17"/>
         </w:rPr>
         <w:t>laura.gomez@ejemplo.com  |  +34 600 000 000  |  Madrid, Spain</w:t>
@@ -66,7 +66,7 @@
         <w:rPr>
           <w:rFonts w:ascii="Arial" w:hAnsi="Arial"/>
           <w:b/>
-          <w:color w:val="1E3D59"/>
+          <w:color w:val="000000"/>
           <w:sz w:val="22"/>
         </w:rPr>
         <w:t>PROFESSIONAL SUMMARY</w:t>
@@ -76,7 +76,7 @@
       <w:r>
         <w:rPr>
           <w:rFonts w:ascii="Arial" w:hAnsi="Arial"/>
-          <w:color w:val="2C3E50"/>
+          <w:color w:val="111111"/>
           <w:sz w:val="19"/>
         </w:rPr>
         <w:t>Data Engineer with over 5 years designing scalable data pipelines and platforms for healthcare and fintech. Specialist in transforming scattered sources into reliable, governed, high-performance analytical models. I combine product sense and engineering rigor to deliver data people actually use in their decisions.</w:t>
@@ -93,7 +93,7 @@
         <w:rPr>
           <w:rFonts w:ascii="Arial" w:hAnsi="Arial"/>
           <w:b/>
-          <w:color w:val="1E3D59"/>
+          <w:color w:val="000000"/>
           <w:sz w:val="22"/>
         </w:rPr>
         <w:t>WORK EXPERIENCE</w:t>
@@ -125,7 +125,7 @@
             <w:r>
               <w:rPr>
                 <w:rFonts w:ascii="Arial" w:hAnsi="Arial"/>
-                <w:color w:val="555555"/>
+                <w:color w:val="444444"/>
                 <w:sz w:val="20"/>
               </w:rPr>
               <w:t xml:space="preserve"> | HealthData Labs</w:t>
@@ -160,7 +160,7 @@
         <w:rPr>
           <w:rFonts w:ascii="Arial" w:hAnsi="Arial"/>
           <w:i/>
-          <w:color w:val="555555"/>
+          <w:color w:val="444444"/>
           <w:sz w:val="16"/>
         </w:rPr>
         <w:t>Owner of the company's data platform and data governance model.</w:t>
@@ -231,7 +231,7 @@
             <w:r>
               <w:rPr>
                 <w:rFonts w:ascii="Arial" w:hAnsi="Arial"/>
-                <w:color w:val="555555"/>
+                <w:color w:val="444444"/>
                 <w:sz w:val="20"/>
               </w:rPr>
               <w:t xml:space="preserve"> | Banco Nube</w:t>
@@ -295,7 +295,7 @@
         <w:rPr>
           <w:rFonts w:ascii="Arial" w:hAnsi="Arial"/>
           <w:b/>
-          <w:color w:val="1E3D59"/>
+          <w:color w:val="000000"/>
           <w:sz w:val="22"/>
         </w:rPr>
         <w:t>PROJECTS</w:t>
@@ -327,7 +327,7 @@
             <w:r>
               <w:rPr>
                 <w:rFonts w:ascii="Arial" w:hAnsi="Arial"/>
-                <w:color w:val="555555"/>
+                <w:color w:val="444444"/>
                 <w:sz w:val="20"/>
               </w:rPr>
               <w:t xml:space="preserve"> | Tech Lead</w:t>
@@ -362,7 +362,7 @@
         <w:rPr>
           <w:rFonts w:ascii="Arial" w:hAnsi="Arial"/>
           <w:i/>
-          <w:color w:val="555555"/>
+          <w:color w:val="444444"/>
           <w:sz w:val="16"/>
         </w:rPr>
         <w:t>Internal portal where analysts query data without writing SQL.</w:t>
@@ -405,7 +405,7 @@
         <w:rPr>
           <w:rFonts w:ascii="Arial" w:hAnsi="Arial"/>
           <w:b/>
-          <w:color w:val="1E3D59"/>
+          <w:color w:val="000000"/>
           <w:sz w:val="22"/>
         </w:rPr>
         <w:t>EDUCATION</w:t>
@@ -437,7 +437,7 @@
             <w:r>
               <w:rPr>
                 <w:rFonts w:ascii="Arial" w:hAnsi="Arial"/>
-                <w:color w:val="555555"/>
+                <w:color w:val="444444"/>
                 <w:sz w:val="20"/>
               </w:rPr>
               <w:t xml:space="preserve"> | Universidad Politécnica de Madrid</w:t>
@@ -475,7 +475,7 @@
         <w:rPr>
           <w:rFonts w:ascii="Arial" w:hAnsi="Arial"/>
           <w:b/>
-          <w:color w:val="1E3D59"/>
+          <w:color w:val="000000"/>
           <w:sz w:val="22"/>
         </w:rPr>
         <w:t>TECHNICAL SKILLS</w:t>
@@ -496,7 +496,7 @@
       <w:r>
         <w:rPr>
           <w:rFonts w:ascii="Arial" w:hAnsi="Arial"/>
-          <w:color w:val="2C3E50"/>
+          <w:color w:val="111111"/>
           <w:sz w:val="19"/>
         </w:rPr>
         <w:t>Python, SQL, Spark, Airflow, dbt, Kafka</w:t>
@@ -517,7 +517,7 @@
       <w:r>
         <w:rPr>
           <w:rFonts w:ascii="Arial" w:hAnsi="Arial"/>
-          <w:color w:val="2C3E50"/>
+          <w:color w:val="111111"/>
           <w:sz w:val="19"/>
         </w:rPr>
         <w:t>AWS, Snowflake, Databricks, Docker, Terraform</w:t>
@@ -538,7 +538,7 @@
       <w:r>
         <w:rPr>
           <w:rFonts w:ascii="Arial" w:hAnsi="Arial"/>
-          <w:color w:val="2C3E50"/>
+          <w:color w:val="111111"/>
           <w:sz w:val="19"/>
         </w:rPr>
         <w:t>Data Contracts, Data testing, Data catalog, Lineage</w:t>
@@ -555,7 +555,7 @@
         <w:rPr>
           <w:rFonts w:ascii="Arial" w:hAnsi="Arial"/>
           <w:b/>
-          <w:color w:val="1E3D59"/>
+          <w:color w:val="000000"/>
           <w:sz w:val="22"/>
         </w:rPr>
         <w:t>PUBLICATIONS</w:t>
@@ -584,7 +584,7 @@
       <w:r>
         <w:rPr>
           <w:rFonts w:ascii="Arial" w:hAnsi="Arial"/>
-          <w:color w:val="1E3D59"/>
+          <w:color w:val="000000"/>
           <w:sz w:val="17"/>
         </w:rPr>
         <w:t xml:space="preserve">  |  https://example.com/pub/2024</w:t>
@@ -601,7 +601,7 @@
         <w:rPr>
           <w:rFonts w:ascii="Arial" w:hAnsi="Arial"/>
           <w:b/>
-          <w:color w:val="1E3D59"/>
+          <w:color w:val="000000"/>
           <w:sz w:val="22"/>
         </w:rPr>
         <w:t>CERTIFICATIONS</w:t>
@@ -644,7 +644,7 @@
         <w:rPr>
           <w:rFonts w:ascii="Arial" w:hAnsi="Arial"/>
           <w:b/>
-          <w:color w:val="1E3D59"/>
+          <w:color w:val="000000"/>
           <w:sz w:val="22"/>
         </w:rPr>
         <w:t>LANGUAGES</w:t>
@@ -665,7 +665,7 @@
       <w:r>
         <w:rPr>
           <w:rFonts w:ascii="Arial" w:hAnsi="Arial"/>
-          <w:color w:val="2C3E50"/>
+          <w:color w:val="111111"/>
           <w:sz w:val="19"/>
         </w:rPr>
         <w:t xml:space="preserve"> — Native</w:t>
@@ -686,7 +686,7 @@
       <w:r>
         <w:rPr>
           <w:rFonts w:ascii="Arial" w:hAnsi="Arial"/>
-          <w:color w:val="2C3E50"/>
+          <w:color w:val="111111"/>
           <w:sz w:val="19"/>
         </w:rPr>
         <w:t xml:space="preserve"> — Advanced (C1)</w:t>

</xml_diff>